<commit_message>
feat(weeeu): CMD #115-P-B tree survey fix — mint U-69 + docx U-19b/U-19c/U-69
A) Word_WeeeU.docx: เพิ่มแถว U-19b + U-19c + U-69 (3 rows · 59 total)
B) U-19b heading ใน docx: ชำระเงิน — พักเงินกลาง (Resell Awaiting Payment)
D) mint U-69 สำหรับ /resell/orders/[id]/review (U-RES-REV) ใน SCREEN_MAP
   Retired U-16a / U-16b / U-58 ✅ (already marked in docx — no action)

build: ✅ 1 successful · jest: ✅ 118/118 PASS

Co-Authored-By: Claude Sonnet 4.6 <noreply@anthropic.com>
</commit_message>
<xml_diff>
--- a/docs/Word_WeeeU.docx
+++ b/docs/Word_WeeeU.docx
@@ -10515,6 +10515,471 @@
                 <w:sz w:val="15"/>
               </w:rPr>
               <w:t>—</w:t>
+            </w:r>
+          </w:p>
+        </w:tc>
+      </w:tr>
+      <w:tr>
+        <w:tc>
+          <w:tcPr>
+            <w:tcW w:type="dxa" w:w="794"/>
+            <w:shd w:val="clear" w:color="auto" w:fill="F0F0F0"/>
+            <w:tcBorders>
+              <w:top w:val="single" w:sz="4" w:space="0" w:color="CCCCCC"/>
+              <w:left w:val="single" w:sz="4" w:space="0" w:color="CCCCCC"/>
+              <w:bottom w:val="single" w:sz="4" w:space="0" w:color="CCCCCC"/>
+              <w:right w:val="single" w:sz="4" w:space="0" w:color="CCCCCC"/>
+            </w:tcBorders>
+          </w:tcPr>
+          <w:p>
+            <w:r>
+              <w:t>U-19b</w:t>
+            </w:r>
+          </w:p>
+        </w:tc>
+        <w:tc>
+          <w:tcPr>
+            <w:tcW w:type="dxa" w:w="1984"/>
+            <w:shd w:val="clear" w:color="auto" w:fill="F0F0F0"/>
+            <w:tcBorders>
+              <w:top w:val="single" w:sz="4" w:space="0" w:color="CCCCCC"/>
+              <w:left w:val="single" w:sz="4" w:space="0" w:color="CCCCCC"/>
+              <w:bottom w:val="single" w:sz="4" w:space="0" w:color="CCCCCC"/>
+              <w:right w:val="single" w:sz="4" w:space="0" w:color="CCCCCC"/>
+            </w:tcBorders>
+          </w:tcPr>
+          <w:p>
+            <w:r>
+              <w:t>ชำระเงิน — พักเงินกลาง (Resell Awaiting Payment)</w:t>
+            </w:r>
+          </w:p>
+        </w:tc>
+        <w:tc>
+          <w:tcPr>
+            <w:tcW w:type="dxa" w:w="1701"/>
+            <w:shd w:val="clear" w:color="auto" w:fill="F0F0F0"/>
+            <w:tcBorders>
+              <w:top w:val="single" w:sz="4" w:space="0" w:color="CCCCCC"/>
+              <w:left w:val="single" w:sz="4" w:space="0" w:color="CCCCCC"/>
+              <w:bottom w:val="single" w:sz="4" w:space="0" w:color="CCCCCC"/>
+              <w:right w:val="single" w:sz="4" w:space="0" w:color="CCCCCC"/>
+            </w:tcBorders>
+          </w:tcPr>
+          <w:p>
+            <w:r>
+              <w:t>U-19 seller ยืนยัน → ล็อค Gold</w:t>
+            </w:r>
+          </w:p>
+        </w:tc>
+        <w:tc>
+          <w:tcPr>
+            <w:tcW w:type="dxa" w:w="1701"/>
+            <w:shd w:val="clear" w:color="auto" w:fill="F0F0F0"/>
+            <w:tcBorders>
+              <w:top w:val="single" w:sz="4" w:space="0" w:color="CCCCCC"/>
+              <w:left w:val="single" w:sz="4" w:space="0" w:color="CCCCCC"/>
+              <w:bottom w:val="single" w:sz="4" w:space="0" w:color="CCCCCC"/>
+              <w:right w:val="single" w:sz="4" w:space="0" w:color="CCCCCC"/>
+            </w:tcBorders>
+          </w:tcPr>
+          <w:p>
+            <w:r>
+              <w:t>R4 — buyer Gold ไม่พอ รอเติม ≤24 ชม. | R4 seller: รอการชำระ</w:t>
+            </w:r>
+          </w:p>
+        </w:tc>
+        <w:tc>
+          <w:tcPr>
+            <w:tcW w:type="dxa" w:w="1701"/>
+            <w:shd w:val="clear" w:color="auto" w:fill="F0F0F0"/>
+            <w:tcBorders>
+              <w:top w:val="single" w:sz="4" w:space="0" w:color="CCCCCC"/>
+              <w:left w:val="single" w:sz="4" w:space="0" w:color="CCCCCC"/>
+              <w:bottom w:val="single" w:sz="4" w:space="0" w:color="CCCCCC"/>
+              <w:right w:val="single" w:sz="4" w:space="0" w:color="CCCCCC"/>
+            </w:tcBorders>
+          </w:tcPr>
+          <w:p>
+            <w:r>
+              <w:t>U-19c ดูสถานะออเดอร์ (หลังชำระสำเร็จ)</w:t>
+            </w:r>
+          </w:p>
+        </w:tc>
+        <w:tc>
+          <w:tcPr>
+            <w:tcW w:type="dxa" w:w="1474"/>
+            <w:shd w:val="clear" w:color="auto" w:fill="F0F0F0"/>
+            <w:tcBorders>
+              <w:top w:val="single" w:sz="4" w:space="0" w:color="CCCCCC"/>
+              <w:left w:val="single" w:sz="4" w:space="0" w:color="CCCCCC"/>
+              <w:bottom w:val="single" w:sz="4" w:space="0" w:color="CCCCCC"/>
+              <w:right w:val="single" w:sz="4" w:space="0" w:color="CCCCCC"/>
+            </w:tcBorders>
+          </w:tcPr>
+          <w:p>
+            <w:r>
+              <w:t>WeeeR: R-16</w:t>
+            </w:r>
+          </w:p>
+        </w:tc>
+        <w:tc>
+          <w:tcPr>
+            <w:tcW w:type="dxa" w:w="794"/>
+            <w:shd w:val="clear" w:color="auto" w:fill="F0F0F0"/>
+            <w:tcBorders>
+              <w:top w:val="single" w:sz="4" w:space="0" w:color="CCCCCC"/>
+              <w:left w:val="single" w:sz="4" w:space="0" w:color="CCCCCC"/>
+              <w:bottom w:val="single" w:sz="4" w:space="0" w:color="CCCCCC"/>
+              <w:right w:val="single" w:sz="4" w:space="0" w:color="CCCCCC"/>
+            </w:tcBorders>
+          </w:tcPr>
+          <w:p>
+            <w:r>
+              <w:t>R4</w:t>
+            </w:r>
+          </w:p>
+        </w:tc>
+        <w:tc>
+          <w:tcPr>
+            <w:tcW w:type="dxa" w:w="2551"/>
+            <w:shd w:val="clear" w:color="auto" w:fill="F0F0F0"/>
+            <w:tcBorders>
+              <w:top w:val="single" w:sz="4" w:space="0" w:color="CCCCCC"/>
+              <w:left w:val="single" w:sz="4" w:space="0" w:color="CCCCCC"/>
+              <w:bottom w:val="single" w:sz="4" w:space="0" w:color="CCCCCC"/>
+              <w:right w:val="single" w:sz="4" w:space="0" w:color="CCCCCC"/>
+            </w:tcBorders>
+          </w:tcPr>
+          <w:p>
+            <w:r>
+              <w:t>countdown timer · auto-cancel เมื่อหมดเวลา · seller เห็น state รอชำระ</w:t>
+            </w:r>
+          </w:p>
+        </w:tc>
+        <w:tc>
+          <w:tcPr>
+            <w:tcW w:type="dxa" w:w="2154"/>
+            <w:shd w:val="clear" w:color="auto" w:fill="F0F0F0"/>
+            <w:tcBorders>
+              <w:top w:val="single" w:sz="4" w:space="0" w:color="CCCCCC"/>
+              <w:left w:val="single" w:sz="4" w:space="0" w:color="CCCCCC"/>
+              <w:bottom w:val="single" w:sz="4" w:space="0" w:color="CCCCCC"/>
+              <w:right w:val="single" w:sz="4" w:space="0" w:color="CCCCCC"/>
+            </w:tcBorders>
+          </w:tcPr>
+          <w:p>
+            <w:r>
+              <w:t>http://localhost:3002/resell/awaiting-payment/txn-001</w:t>
+            </w:r>
+          </w:p>
+        </w:tc>
+      </w:tr>
+      <w:tr>
+        <w:tc>
+          <w:tcPr>
+            <w:tcW w:type="dxa" w:w="794"/>
+            <w:shd w:val="clear" w:color="auto" w:fill="F0F0F0"/>
+            <w:tcBorders>
+              <w:top w:val="single" w:sz="4" w:space="0" w:color="CCCCCC"/>
+              <w:left w:val="single" w:sz="4" w:space="0" w:color="CCCCCC"/>
+              <w:bottom w:val="single" w:sz="4" w:space="0" w:color="CCCCCC"/>
+              <w:right w:val="single" w:sz="4" w:space="0" w:color="CCCCCC"/>
+            </w:tcBorders>
+          </w:tcPr>
+          <w:p>
+            <w:r>
+              <w:t>U-19c</w:t>
+            </w:r>
+          </w:p>
+        </w:tc>
+        <w:tc>
+          <w:tcPr>
+            <w:tcW w:type="dxa" w:w="1984"/>
+            <w:shd w:val="clear" w:color="auto" w:fill="F0F0F0"/>
+            <w:tcBorders>
+              <w:top w:val="single" w:sz="4" w:space="0" w:color="CCCCCC"/>
+              <w:left w:val="single" w:sz="4" w:space="0" w:color="CCCCCC"/>
+              <w:bottom w:val="single" w:sz="4" w:space="0" w:color="CCCCCC"/>
+              <w:right w:val="single" w:sz="4" w:space="0" w:color="CCCCCC"/>
+            </w:tcBorders>
+          </w:tcPr>
+          <w:p>
+            <w:r>
+              <w:t>รายละเอียดออเดอร์ Resell (Resell Order Detail)</w:t>
+            </w:r>
+          </w:p>
+        </w:tc>
+        <w:tc>
+          <w:tcPr>
+            <w:tcW w:type="dxa" w:w="1701"/>
+            <w:shd w:val="clear" w:color="auto" w:fill="F0F0F0"/>
+            <w:tcBorders>
+              <w:top w:val="single" w:sz="4" w:space="0" w:color="CCCCCC"/>
+              <w:left w:val="single" w:sz="4" w:space="0" w:color="CCCCCC"/>
+              <w:bottom w:val="single" w:sz="4" w:space="0" w:color="CCCCCC"/>
+              <w:right w:val="single" w:sz="4" w:space="0" w:color="CCCCCC"/>
+            </w:tcBorders>
+          </w:tcPr>
+          <w:p>
+            <w:r>
+              <w:t>U-19b หลังชำระ · U-22 offer สำเร็จ</w:t>
+            </w:r>
+          </w:p>
+        </w:tc>
+        <w:tc>
+          <w:tcPr>
+            <w:tcW w:type="dxa" w:w="1701"/>
+            <w:shd w:val="clear" w:color="auto" w:fill="F0F0F0"/>
+            <w:tcBorders>
+              <w:top w:val="single" w:sz="4" w:space="0" w:color="CCCCCC"/>
+              <w:left w:val="single" w:sz="4" w:space="0" w:color="CCCCCC"/>
+              <w:bottom w:val="single" w:sz="4" w:space="0" w:color="CCCCCC"/>
+              <w:right w:val="single" w:sz="4" w:space="0" w:color="CCCCCC"/>
+            </w:tcBorders>
+          </w:tcPr>
+          <w:p>
+            <w:r>
+              <w:t>R6 seller timeout · R8 dispute · R10 complete → review · R11 พัสดุเสีย · R12 mutual cancel</w:t>
+            </w:r>
+          </w:p>
+        </w:tc>
+        <w:tc>
+          <w:tcPr>
+            <w:tcW w:type="dxa" w:w="1701"/>
+            <w:shd w:val="clear" w:color="auto" w:fill="F0F0F0"/>
+            <w:tcBorders>
+              <w:top w:val="single" w:sz="4" w:space="0" w:color="CCCCCC"/>
+              <w:left w:val="single" w:sz="4" w:space="0" w:color="CCCCCC"/>
+              <w:bottom w:val="single" w:sz="4" w:space="0" w:color="CCCCCC"/>
+              <w:right w:val="single" w:sz="4" w:space="0" w:color="CCCCCC"/>
+            </w:tcBorders>
+          </w:tcPr>
+          <w:p>
+            <w:r>
+              <w:t>U-24 ตรวจรับ · U-26 dispute · U-69 review · U-44 เติม Gold</w:t>
+            </w:r>
+          </w:p>
+        </w:tc>
+        <w:tc>
+          <w:tcPr>
+            <w:tcW w:type="dxa" w:w="1474"/>
+            <w:shd w:val="clear" w:color="auto" w:fill="F0F0F0"/>
+            <w:tcBorders>
+              <w:top w:val="single" w:sz="4" w:space="0" w:color="CCCCCC"/>
+              <w:left w:val="single" w:sz="4" w:space="0" w:color="CCCCCC"/>
+              <w:bottom w:val="single" w:sz="4" w:space="0" w:color="CCCCCC"/>
+              <w:right w:val="single" w:sz="4" w:space="0" w:color="CCCCCC"/>
+            </w:tcBorders>
+          </w:tcPr>
+          <w:p>
+            <w:r>
+              <w:t>WeeeR: R-16 · Admin: รับ escalate</w:t>
+            </w:r>
+          </w:p>
+        </w:tc>
+        <w:tc>
+          <w:tcPr>
+            <w:tcW w:type="dxa" w:w="794"/>
+            <w:shd w:val="clear" w:color="auto" w:fill="F0F0F0"/>
+            <w:tcBorders>
+              <w:top w:val="single" w:sz="4" w:space="0" w:color="CCCCCC"/>
+              <w:left w:val="single" w:sz="4" w:space="0" w:color="CCCCCC"/>
+              <w:bottom w:val="single" w:sz="4" w:space="0" w:color="CCCCCC"/>
+              <w:right w:val="single" w:sz="4" w:space="0" w:color="CCCCCC"/>
+            </w:tcBorders>
+          </w:tcPr>
+          <w:p>
+            <w:r>
+              <w:t>R6/R7/R8/R10/R11/R12</w:t>
+            </w:r>
+          </w:p>
+        </w:tc>
+        <w:tc>
+          <w:tcPr>
+            <w:tcW w:type="dxa" w:w="2551"/>
+            <w:shd w:val="clear" w:color="auto" w:fill="F0F0F0"/>
+            <w:tcBorders>
+              <w:top w:val="single" w:sz="4" w:space="0" w:color="CCCCCC"/>
+              <w:left w:val="single" w:sz="4" w:space="0" w:color="CCCCCC"/>
+              <w:bottom w:val="single" w:sz="4" w:space="0" w:color="CCCCCC"/>
+              <w:right w:val="single" w:sz="4" w:space="0" w:color="CCCCCC"/>
+            </w:tcBorders>
+          </w:tcPr>
+          <w:p>
+            <w:r>
+              <w:t>state machine: awaiting_payment→in_progress→inspection_period→completed · is_buyer switch</w:t>
+            </w:r>
+          </w:p>
+        </w:tc>
+        <w:tc>
+          <w:tcPr>
+            <w:tcW w:type="dxa" w:w="2154"/>
+            <w:shd w:val="clear" w:color="auto" w:fill="F0F0F0"/>
+            <w:tcBorders>
+              <w:top w:val="single" w:sz="4" w:space="0" w:color="CCCCCC"/>
+              <w:left w:val="single" w:sz="4" w:space="0" w:color="CCCCCC"/>
+              <w:bottom w:val="single" w:sz="4" w:space="0" w:color="CCCCCC"/>
+              <w:right w:val="single" w:sz="4" w:space="0" w:color="CCCCCC"/>
+            </w:tcBorders>
+          </w:tcPr>
+          <w:p>
+            <w:r>
+              <w:t>http://localhost:3002/resell/orders/ord-001</w:t>
+            </w:r>
+          </w:p>
+        </w:tc>
+      </w:tr>
+      <w:tr>
+        <w:tc>
+          <w:tcPr>
+            <w:tcW w:type="dxa" w:w="794"/>
+            <w:shd w:val="clear" w:color="auto" w:fill="F0F0F0"/>
+            <w:tcBorders>
+              <w:top w:val="single" w:sz="4" w:space="0" w:color="CCCCCC"/>
+              <w:left w:val="single" w:sz="4" w:space="0" w:color="CCCCCC"/>
+              <w:bottom w:val="single" w:sz="4" w:space="0" w:color="CCCCCC"/>
+              <w:right w:val="single" w:sz="4" w:space="0" w:color="CCCCCC"/>
+            </w:tcBorders>
+          </w:tcPr>
+          <w:p>
+            <w:r>
+              <w:t>U-69</w:t>
+            </w:r>
+          </w:p>
+        </w:tc>
+        <w:tc>
+          <w:tcPr>
+            <w:tcW w:type="dxa" w:w="1984"/>
+            <w:shd w:val="clear" w:color="auto" w:fill="F0F0F0"/>
+            <w:tcBorders>
+              <w:top w:val="single" w:sz="4" w:space="0" w:color="CCCCCC"/>
+              <w:left w:val="single" w:sz="4" w:space="0" w:color="CCCCCC"/>
+              <w:bottom w:val="single" w:sz="4" w:space="0" w:color="CCCCCC"/>
+              <w:right w:val="single" w:sz="4" w:space="0" w:color="CCCCCC"/>
+            </w:tcBorders>
+          </w:tcPr>
+          <w:p>
+            <w:r>
+              <w:t>ให้คะแนน Resell (Resell R10 Review)</w:t>
+            </w:r>
+          </w:p>
+        </w:tc>
+        <w:tc>
+          <w:tcPr>
+            <w:tcW w:type="dxa" w:w="1701"/>
+            <w:shd w:val="clear" w:color="auto" w:fill="F0F0F0"/>
+            <w:tcBorders>
+              <w:top w:val="single" w:sz="4" w:space="0" w:color="CCCCCC"/>
+              <w:left w:val="single" w:sz="4" w:space="0" w:color="CCCCCC"/>
+              <w:bottom w:val="single" w:sz="4" w:space="0" w:color="CCCCCC"/>
+              <w:right w:val="single" w:sz="4" w:space="0" w:color="CCCCCC"/>
+            </w:tcBorders>
+          </w:tcPr>
+          <w:p>
+            <w:r>
+              <w:t>U-19c completed state</w:t>
+            </w:r>
+          </w:p>
+        </w:tc>
+        <w:tc>
+          <w:tcPr>
+            <w:tcW w:type="dxa" w:w="1701"/>
+            <w:shd w:val="clear" w:color="auto" w:fill="F0F0F0"/>
+            <w:tcBorders>
+              <w:top w:val="single" w:sz="4" w:space="0" w:color="CCCCCC"/>
+              <w:left w:val="single" w:sz="4" w:space="0" w:color="CCCCCC"/>
+              <w:bottom w:val="single" w:sz="4" w:space="0" w:color="CCCCCC"/>
+              <w:right w:val="single" w:sz="4" w:space="0" w:color="CCCCCC"/>
+            </w:tcBorders>
+          </w:tcPr>
+          <w:p>
+            <w:r>
+              <w:t>R10 — ธุรกรรมสำเร็จ ทั้ง buyer และ seller ให้คะแนนกัน</w:t>
+            </w:r>
+          </w:p>
+        </w:tc>
+        <w:tc>
+          <w:tcPr>
+            <w:tcW w:type="dxa" w:w="1701"/>
+            <w:shd w:val="clear" w:color="auto" w:fill="F0F0F0"/>
+            <w:tcBorders>
+              <w:top w:val="single" w:sz="4" w:space="0" w:color="CCCCCC"/>
+              <w:left w:val="single" w:sz="4" w:space="0" w:color="CCCCCC"/>
+              <w:bottom w:val="single" w:sz="4" w:space="0" w:color="CCCCCC"/>
+              <w:right w:val="single" w:sz="4" w:space="0" w:color="CCCCCC"/>
+            </w:tcBorders>
+          </w:tcPr>
+          <w:p>
+            <w:r>
+              <w:t>U-19c กลับออเดอร์</w:t>
+            </w:r>
+          </w:p>
+        </w:tc>
+        <w:tc>
+          <w:tcPr>
+            <w:tcW w:type="dxa" w:w="1474"/>
+            <w:shd w:val="clear" w:color="auto" w:fill="F0F0F0"/>
+            <w:tcBorders>
+              <w:top w:val="single" w:sz="4" w:space="0" w:color="CCCCCC"/>
+              <w:left w:val="single" w:sz="4" w:space="0" w:color="CCCCCC"/>
+              <w:bottom w:val="single" w:sz="4" w:space="0" w:color="CCCCCC"/>
+              <w:right w:val="single" w:sz="4" w:space="0" w:color="CCCCCC"/>
+            </w:tcBorders>
+          </w:tcPr>
+          <w:p>
+            <w:r>
+              <w:t>WeeeR: รับการ rate</w:t>
+            </w:r>
+          </w:p>
+        </w:tc>
+        <w:tc>
+          <w:tcPr>
+            <w:tcW w:type="dxa" w:w="794"/>
+            <w:shd w:val="clear" w:color="auto" w:fill="F0F0F0"/>
+            <w:tcBorders>
+              <w:top w:val="single" w:sz="4" w:space="0" w:color="CCCCCC"/>
+              <w:left w:val="single" w:sz="4" w:space="0" w:color="CCCCCC"/>
+              <w:bottom w:val="single" w:sz="4" w:space="0" w:color="CCCCCC"/>
+              <w:right w:val="single" w:sz="4" w:space="0" w:color="CCCCCC"/>
+            </w:tcBorders>
+          </w:tcPr>
+          <w:p>
+            <w:r>
+              <w:t>R10</w:t>
+            </w:r>
+          </w:p>
+        </w:tc>
+        <w:tc>
+          <w:tcPr>
+            <w:tcW w:type="dxa" w:w="2551"/>
+            <w:shd w:val="clear" w:color="auto" w:fill="F0F0F0"/>
+            <w:tcBorders>
+              <w:top w:val="single" w:sz="4" w:space="0" w:color="CCCCCC"/>
+              <w:left w:val="single" w:sz="4" w:space="0" w:color="CCCCCC"/>
+              <w:bottom w:val="single" w:sz="4" w:space="0" w:color="CCCCCC"/>
+              <w:right w:val="single" w:sz="4" w:space="0" w:color="CCCCCC"/>
+            </w:tcBorders>
+          </w:tcPr>
+          <w:p>
+            <w:r>
+              <w:t>ดาว 1-5 · tags · comment · is_buyer/seller view · mint U-69 (P-B Tree Survey)</w:t>
+            </w:r>
+          </w:p>
+        </w:tc>
+        <w:tc>
+          <w:tcPr>
+            <w:tcW w:type="dxa" w:w="2154"/>
+            <w:shd w:val="clear" w:color="auto" w:fill="F0F0F0"/>
+            <w:tcBorders>
+              <w:top w:val="single" w:sz="4" w:space="0" w:color="CCCCCC"/>
+              <w:left w:val="single" w:sz="4" w:space="0" w:color="CCCCCC"/>
+              <w:bottom w:val="single" w:sz="4" w:space="0" w:color="CCCCCC"/>
+              <w:right w:val="single" w:sz="4" w:space="0" w:color="CCCCCC"/>
+            </w:tcBorders>
+          </w:tcPr>
+          <w:p>
+            <w:r>
+              <w:t>http://localhost:3002/resell/orders/ord-001/review</w:t>
             </w:r>
           </w:p>
         </w:tc>

</xml_diff>